<commit_message>
Update project files and documentation
</commit_message>
<xml_diff>
--- a/Capstone_Project_Report.docx
+++ b/Capstone_Project_Report.docx
@@ -13,16 +13,7 @@
           <w:b/>
           <w:sz w:val="36"/>
         </w:rPr>
-        <w:t>GoREST BDD API Automation &amp;</w:t>
-      </w:r>
-      <w:r>
-        <w:rPr>
-          <w:rFonts w:ascii="Times New Roman" w:hAnsi="Times New Roman"/>
-          <w:b/>
-          <w:sz w:val="36"/>
-        </w:rPr>
-        <w:br/>
-        <w:t>Quality Engineering Framework</w:t>
+        <w:t>GoREST API AUTOMATION FRAMEWORK</w:t>
       </w:r>
     </w:p>
     <w:p>
@@ -129,7 +120,7 @@
           <w:rFonts w:ascii="Times New Roman" w:hAnsi="Times New Roman"/>
           <w:sz w:val="24"/>
         </w:rPr>
-        <w:t>I hereby declare that the project report entitled "GoREST BDD API Automation &amp; Quality Engineering Framework" presents the work carried out by me as part of the Wipro-organized Quality Engineering and Automation value-added course.</w:t>
+        <w:t>I hereby declare that the project report entitled "GoREST API Automation Framework" presents the work carried out by me as part of the Wipro-organized Quality Engineering and Automation value-added course.</w:t>
       </w:r>
     </w:p>
     <w:p>
@@ -790,7 +781,7 @@
           <w:rFonts w:ascii="Times New Roman" w:hAnsi="Times New Roman"/>
           <w:sz w:val="24"/>
         </w:rPr>
-        <w:t>The automation suite was evaluated against the live GoREST users endpoint across CRUD operations (POST, GET, PATCH, and automated DELETE teardown), negative validation cases, and security boundaries. In the primary functional test run, all five planned scenarios passed successfully, validating user creation (HTTP 201), retrieval (HTTP 200), partial field updates (HTTP 200), unauthorized access rejection (HTTP 401), and non-existent resource handling (HTTP 404). In a dedicated performance verification run, an HTTP request response time of 2.049 seconds was recorded, triggering an assertion failure against a configured 2.0-second SLA threshold and verifying that the SLA enforcement check operates accurately. Detailed test artifacts are produced via Allure Reports and a real-time web telemetry dashboard.</w:t>
+        <w:t>The automation suite was evaluated against the live GoREST users endpoint across CRUD lifecycle coverage, with the framework automating user lifecycle operations including POST, GET, and PATCH, with DELETE implemented as automated post-scenario teardown, alongside negative validation cases and security boundaries. In the primary functional suite, all five planned scenarios passed successfully, achieving a 100% functional pass rate across 23 individual test steps, validating user creation (HTTP 201), retrieval (HTTP 200), partial field updates (HTTP 200), unauthorized access rejection (HTTP 401), and non-existent resource handling (HTTP 404). In a separate boundary verification, an observed response time of 2.049 seconds exceeded the configured 2.0-second response-time threshold, causing the SLA assertion to fail as expected and confirming that the framework correctly detects response-time violations. Detailed test artifacts are produced via Allure Reports and a real-time web telemetry dashboard.</w:t>
       </w:r>
     </w:p>
     <w:p>
@@ -1414,7 +1405,7 @@
           <w:rFonts w:ascii="Times New Roman" w:hAnsi="Times New Roman"/>
           <w:sz w:val="24"/>
         </w:rPr>
-        <w:t>Automating API testing can provide rapid and reliable regression detection across Create, Read, Update, and Delete lifecycles. Repeated manual execution of RESTful endpoints using ad-hoc tools is labor-intensive and prone to human verification oversights. Programmatic verification helps ensure that HTTP response status codes, headers, and payload structures conform to specifications whenever backend modifications or service updates are deployed.</w:t>
+        <w:t>Automating API testing can provide rapid and reliable regression detection across CRUD lifecycle coverage, validating entity creation, retrieval, and update operations while automating teardown to keep data stores consistent. Repeated manual execution of RESTful endpoints using ad-hoc tools is labor-intensive and prone to human verification oversights. Programmatic verification helps ensure that HTTP response status codes, headers, and payload structures conform to specifications whenever backend modifications or service updates are deployed.</w:t>
       </w:r>
     </w:p>
     <w:p>
@@ -1454,7 +1445,7 @@
           <w:rFonts w:ascii="Times New Roman" w:hAnsi="Times New Roman"/>
           <w:sz w:val="24"/>
         </w:rPr>
-        <w:t>The primary objective of this capstone project is to design and implement a Behavior-Driven Development test automation framework in Python using Behave. The framework automates CRUD operations against the live GoREST public user endpoints, covering POST, GET, PATCH, and automated DELETE teardown. To ensure reliable execution over public networks, the framework integrates an HTTP client equipped with connection pooling, automatic retries, and exponential backoff.</w:t>
+        <w:t>The primary objective of this capstone project is to design and implement a Behavior-Driven Development test automation framework in Python using Behave. The framework automates user lifecycle operations including POST, GET, and PATCH, with DELETE implemented as automated post-scenario teardown against the live GoREST public user endpoints. To ensure reliable execution over public networks, the framework integrates an HTTP client equipped with connection pooling, automatic retries, and exponential backoff.</w:t>
       </w:r>
     </w:p>
     <w:p>
@@ -1502,7 +1493,7 @@
           <w:rFonts w:ascii="Times New Roman" w:hAnsi="Times New Roman"/>
           <w:sz w:val="24"/>
         </w:rPr>
-        <w:t>The functional scope of this project encompasses CRUD operations against the GoREST `/public/v2/users` endpoint, implemented across POST, GET, PATCH, and automated DELETE teardown operations. Testing validates successful user entity creation via HTTP POST, retrieval via HTTP GET, partial attribute modification via HTTP PATCH, and automated resource cleanup via HTTP DELETE. The scope also includes negative validation scenarios, verifying unauthorized access rejection (HTTP 401) and missing entity handling (HTTP 404), as well as response latency verification against a configured 2.0-second SLA threshold.</w:t>
+        <w:t>The functional scope of this project encompasses CRUD lifecycle coverage against the GoREST `/public/v2/users` endpoint. The primary functional scenarios validate user entity creation via HTTP POST, retrieval via HTTP GET, and partial attribute modification via HTTP PATCH, with DELETE implemented as automated post-scenario teardown. The scope also includes negative validation scenarios, verifying unauthorized access rejection (HTTP 401) and missing entity handling (HTTP 404), as well as response latency verification against a configured 2.0-second response-time threshold.</w:t>
       </w:r>
     </w:p>
     <w:p>
@@ -2299,7 +2290,7 @@
                 <w:rFonts w:ascii="Times New Roman" w:hAnsi="Times New Roman"/>
                 <w:sz w:val="20"/>
               </w:rPr>
-              <w:t>Enforces Bearer Token Authorization for state-changing operations.</w:t>
+              <w:t>Enforces Bearer Token Authorization for state-changing operations, while the framework supplies the configured authentication header for protected endpoint requests.</w:t>
             </w:r>
           </w:p>
         </w:tc>
@@ -2374,7 +2365,7 @@
                 <w:rFonts w:ascii="Times New Roman" w:hAnsi="Times New Roman"/>
                 <w:sz w:val="20"/>
               </w:rPr>
-              <w:t>Full support for POST, GET, PUT, PATCH, and DELETE operations.</w:t>
+              <w:t>Full support for user lifecycle operations (POST, GET, PATCH, and automated DELETE teardown).</w:t>
             </w:r>
           </w:p>
         </w:tc>
@@ -3954,7 +3945,7 @@
                 <w:rFonts w:ascii="Times New Roman" w:hAnsi="Times New Roman"/>
                 <w:sz w:val="20"/>
               </w:rPr>
-              <w:t>The framework must measure per-request response times and assert compliance against a configured 2.0-second SLA threshold.</w:t>
+              <w:t>The framework must measure per-request response times and assert compliance against a configured 2.0-second response-time threshold (&lt; 2.0s).</w:t>
             </w:r>
           </w:p>
         </w:tc>
@@ -4746,7 +4737,7 @@
           <w:rFonts w:ascii="Times New Roman" w:hAnsi="Times New Roman"/>
           <w:sz w:val="24"/>
         </w:rPr>
-        <w:t>Test execution follows a rigorous sequential lifecycle managed by Behave. Figure 2 details the workflow from feature loading through scenario execution, dynamic data generation, request dispatch, schema verification, and automated resource teardown.</w:t>
+        <w:t>Test execution follows a rigorous sequential lifecycle managed by Behave. Figure 2 details the workflow from feature loading through scenario execution, dynamic data generation, request dispatch, schema verification, and automated post-scenario resource teardown via DELETE.</w:t>
       </w:r>
     </w:p>
     <w:p>
@@ -4820,7 +4811,7 @@
           <w:rFonts w:ascii="Times New Roman" w:hAnsi="Times New Roman"/>
           <w:sz w:val="24"/>
         </w:rPr>
-        <w:t>Before scenario execution begins, the `before_all` hook verifies API reachability and loads configuration parameters. During scenario execution, the step definitions dynamically synthesize payloads and transmit HTTP requests through the resilient client. At the conclusion of each scenario, the `after_scenario` hook purges created entities from the remote server, helping maintain data isolation between test runs.</w:t>
+        <w:t>Before scenario execution begins, the `before_all` hook verifies API reachability and loads configuration parameters. During scenario execution, the step definitions dynamically synthesize payloads and transmit HTTP requests through the resilient client. At the conclusion of each scenario, the `after_scenario` hook purges created entities from the remote server via automated DELETE teardown, helping maintain data isolation between test runs.</w:t>
       </w:r>
     </w:p>
     <w:p>
@@ -5639,7 +5630,7 @@
           <w:rFonts w:ascii="Times New Roman" w:hAnsi="Times New Roman"/>
           <w:sz w:val="24"/>
         </w:rPr>
-        <w:t>This function constructs HTTP request headers by retrieving the Bearer token from environment variables. It applies a fallback token if unconfigured and formats standard JSON Content-Type and Accept headers.</w:t>
+        <w:t>This function constructs HTTP request headers by retrieving the Bearer token from the GOREST_TOKEN environment variable. The displayed fallback token serves as a development placeholder when the environment variable is not configured, while actual test executions supply credentials securely through the environment. The function formats standard JSON Content-Type, Accept, and Bearer Authorization headers.</w:t>
       </w:r>
     </w:p>
     <w:p>
@@ -5818,15 +5809,7 @@
           <w:rFonts w:ascii="Times New Roman" w:hAnsi="Times New Roman"/>
           <w:sz w:val="24"/>
         </w:rPr>
-        <w:t xml:space="preserve">GoREST enforces Bearer token authentication for all state-changing endpoints (POST, PUT, PATCH, DELETE). The framework retrieves the Bearer token from the GOREST_TOKEN environment variable and uses a fallback value when the variable is not configured. Unauthorized </w:t>
-      </w:r>
-      <w:r>
-        <w:rPr>
-          <w:rFonts w:ascii="Times New Roman" w:hAnsi="Times New Roman"/>
-          <w:sz w:val="24"/>
-        </w:rPr>
-        <w:lastRenderedPageBreak/>
-        <w:t>negative test scenarios pass an empty or malformed token to verify that the API returns HTTP 401 Unauthorized.</w:t>
+        <w:t>Authenticated requests in the framework use the configured Bearer token. State-changing operations require Bearer authorization, while the framework also supplies the configured authentication header for protected endpoint requests. The framework retrieves the Bearer token from the GOREST_TOKEN environment variable, while the displayed fallback value is a development placeholder rather than a secure credential; real credentials should not be hardcoded. Unauthorized negative test scenarios pass an empty or malformed token to verify that the API returns HTTP 401 Unauthorized.</w:t>
       </w:r>
     </w:p>
     <w:p>
@@ -6109,7 +6092,7 @@
           <w:rFonts w:ascii="Times New Roman" w:hAnsi="Times New Roman"/>
           <w:sz w:val="24"/>
         </w:rPr>
-        <w:t>This function validates response JSON structures against a predefined schema specification adhering to Draft 2020-12. It verifies field existence, data types, and enum values, raising a descriptive error upon contract violations.</w:t>
+        <w:t>This function validates response JSON structures against a predefined schema specification adhering to Draft 2020-12. The schema defines an email format constraint in addition to the string type requirement. It verifies field existence, data types, and enum values, raising a descriptive error upon contract violations.</w:t>
       </w:r>
     </w:p>
     <w:p>
@@ -6527,7 +6510,7 @@
           <w:rFonts w:ascii="Times New Roman" w:hAnsi="Times New Roman"/>
           <w:sz w:val="24"/>
         </w:rPr>
-        <w:t>The experimental evaluation of the framework was conducted by executing the automated BDD test suite directly against the live GoREST public API. The test suite comprises five primary scenarios: user creation (POST), user retrieval (GET), partial attribute modification (PATCH), unauthorized access verification (negative 401), and non-existent resource handling (negative 404). Each scenario was executed sequentially to measure functional correctness, response latency, and cleanup efficacy.</w:t>
+        <w:t>The experimental evaluation of the framework was conducted by executing the automated BDD test suite directly against the live GoREST public API. The primary functional suite comprises five scenarios: user creation (POST), user retrieval (GET), partial attribute modification (PATCH), unauthorized access verification (negative 401), and non-existent resource handling (negative 404), with entity cleanup handled through automated post-scenario DELETE teardown. Each scenario was executed sequentially to measure functional correctness, response latency, and cleanup efficacy.</w:t>
       </w:r>
     </w:p>
     <w:p>
@@ -7199,7 +7182,7 @@
           <w:rFonts w:ascii="Times New Roman" w:hAnsi="Times New Roman"/>
           <w:sz w:val="24"/>
         </w:rPr>
-        <w:t>In the primary functional test run, all five planned scenarios passed successfully, achieving a 100% functional pass rate across 23 individual test steps. Table 8 summarizes the execution status, step counts, and duration for each scenario.</w:t>
+        <w:t>In the primary functional suite, all five planned scenarios passed successfully, achieving a 100% functional pass rate across 23 individual test steps. Table 8 presents scenario-level execution timings recorded during the detailed scenario measurement run.</w:t>
       </w:r>
     </w:p>
     <w:p>
@@ -8055,7 +8038,7 @@
           <w:rFonts w:ascii="Times New Roman" w:hAnsi="Times New Roman"/>
           <w:sz w:val="24"/>
         </w:rPr>
-        <w:t>Response latencies were captured for each HTTP request to evaluate compliance with a configured 2.0-second SLA threshold. Table 9 summarizes the recorded response times across tested operations.</w:t>
+        <w:t>Response latencies were captured for each HTTP request to evaluate compliance against a configured 2.0-second response-time threshold. Requests with response times below 2.0 seconds are considered compliant. Table 9 summarizes the recorded response times across tested operations.</w:t>
       </w:r>
     </w:p>
     <w:p>
@@ -8701,7 +8684,7 @@
           <w:rFonts w:ascii="Times New Roman" w:hAnsi="Times New Roman"/>
           <w:sz w:val="24"/>
         </w:rPr>
-        <w:t>To verify that the SLA assertion logic functions correctly when a response exceeds the configured threshold, a dedicated boundary test was conducted. When a POST request required 2.049 seconds during the boundary test, the assertion step correctly failed against the 2.0-second threshold (`AssertionError: Step failed: POST request duration 2.049s exceeded 2.0s threshold`). Figure 4 illustrates the captured failure trace in the execution log.</w:t>
+        <w:t>A dedicated boundary verification was conducted separately from the primary functional suite. The observed response time of 2.049 seconds exceeded the configured 2.0-second response-time threshold, causing the SLA assertion to fail as expected (`AssertionError: Step failed: POST request duration 2.049s exceeded 2.0s threshold`). This intentional verification confirmed that the framework's SLA enforcement mechanism correctly detects response-time violations without affecting the 100% functional pass rate of the primary functional suite. Figure 4 illustrates the captured failure trace in the execution log.</w:t>
       </w:r>
     </w:p>
     <w:p>
@@ -8790,7 +8773,7 @@
           <w:rFonts w:ascii="Times New Roman" w:hAnsi="Times New Roman"/>
           <w:sz w:val="24"/>
         </w:rPr>
-        <w:t>Automated resource teardown was tracked during test execution. Table 10 documents entity deletion requests and HTTP 204 responses across test runs.</w:t>
+        <w:t>Automated resource teardown was tracked during test execution. Table 10 documents selected entity deletion and teardown observations recorded during test runs.</w:t>
       </w:r>
     </w:p>
     <w:p>
@@ -9396,7 +9379,6 @@
           <w:rFonts w:ascii="Times New Roman" w:hAnsi="Times New Roman"/>
           <w:sz w:val="24"/>
         </w:rPr>
-        <w:lastRenderedPageBreak/>
         <w:t>Figure 7 illustrates the Allure Test Report overview for the primary functional test run, confirming a 100% functional pass rate across all five planned scenarios, total execution runtime, and environment metadata.</w:t>
       </w:r>
     </w:p>
@@ -9755,7 +9737,7 @@
           <w:rFonts w:ascii="Times New Roman" w:hAnsi="Times New Roman"/>
           <w:sz w:val="24"/>
         </w:rPr>
-        <w:t>This capstone project designed, implemented, and validated an automated Behavior-Driven Development (BDD) testing framework for RESTful APIs, evaluated against the live GoREST public service. By integrating Behave with resilient HTTP networking, dynamic synthetic data generation, formal JSON Schema contract validation, automated entity teardown, and security redaction, the framework addresses common operational challenges encountered when testing remote cloud APIs. The results demonstrate that the BDD structure provides a readable and organized approach for specifying and executing API tests.</w:t>
+        <w:t>This capstone project designed, implemented, and validated an automated Behavior-Driven Development (BDD) testing framework for RESTful APIs, evaluated against the live GoREST public service. By integrating Behave with resilient HTTP networking, dynamic synthetic data generation, formal JSON Schema contract validation, automated post-scenario DELETE teardown, and security redaction, the framework addresses common operational challenges encountered when testing remote cloud APIs. The results demonstrate that the BDD structure provides a readable and organized approach for specifying and executing API tests.</w:t>
       </w:r>
     </w:p>
     <w:p>
@@ -9782,7 +9764,7 @@
           <w:rFonts w:ascii="Times New Roman" w:hAnsi="Times New Roman"/>
           <w:sz w:val="24"/>
         </w:rPr>
-        <w:t>The project accomplished several technical objectives in automating and validating the target API. First, the framework implemented POST, GET, and PATCH user operations together with automated DELETE teardown against the live GoREST service. The five primary functional scenarios achieved a 100% pass rate across 23 individual test steps. To handle public network instability, resilient HTTP networking was implemented using Urllib3 connection pooling, automatic retries, and exponential backoff, providing automatic retry handling for configured transient rate-limit and server-error responses.</w:t>
+        <w:t>The project accomplished several technical objectives in automating and validating the target API. First, the framework automates user lifecycle operations including POST, GET, and PATCH, with DELETE implemented as automated post-scenario teardown against the live GoREST service. The five primary functional scenarios achieved a 100% functional pass rate across 23 individual test steps. To handle public network instability, resilient HTTP networking was implemented using Urllib3 connection pooling, automatic retries, and exponential backoff, providing automatic retry handling for configured transient rate-limit and server-error responses.</w:t>
       </w:r>
     </w:p>
     <w:p>
@@ -9925,7 +9907,7 @@
           <w:rFonts w:ascii="Times New Roman" w:hAnsi="Times New Roman"/>
           <w:sz w:val="24"/>
         </w:rPr>
-        <w:t>The appendix contains selected execution-log entries from the primary five-scenario run:</w:t>
+        <w:t>Appendix A provides a selected execution-log extract from a functional test run, in which five scenarios completed successfully in 3.104 seconds:</w:t>
       </w:r>
     </w:p>
     <w:p>
@@ -10122,7 +10104,7 @@
           <w:rFonts w:ascii="Times New Roman" w:hAnsi="Times New Roman"/>
           <w:sz w:val="24"/>
         </w:rPr>
-        <w:t>This terminal log extract documents selected scenarios from the primary test run, showing step-level timing, status assertions, and the final 100% pass outcome across the user management feature suite.</w:t>
+        <w:t>This terminal log extract documents selected scenarios from the selected execution-log run, showing step-level timing, status assertions, and the final 100% pass outcome across the user management feature suite.</w:t>
       </w:r>
     </w:p>
     <w:p>
@@ -10325,7 +10307,7 @@
           <w:rFonts w:ascii="Times New Roman" w:hAnsi="Times New Roman"/>
           <w:sz w:val="24"/>
         </w:rPr>
-        <w:t>This schema file is used for contract validation of the user response payloads covered by the test suite, validating required fields, data types, and gender/status enumeration values according to the defined schema.</w:t>
+        <w:t>This schema file is used for contract validation of the user response payloads covered by the test suite. The schema defines an email format constraint in addition to the string type requirement, validating required fields, data types, and gender/status enumeration values according to the defined schema.</w:t>
       </w:r>
     </w:p>
     <w:p>

</xml_diff>